<commit_message>
removed temporary word file personal docs notes
</commit_message>
<xml_diff>
--- a/docs/Personal Notes.docx
+++ b/docs/Personal Notes.docx
@@ -140,128 +140,132 @@
       <w:r>
         <w:t>Then</w:t>
       </w:r>
+    </w:p>
+    <w:p>
+      <w:r>
+        <w:t>R=</w:t>
+      </w:r>
+      <w:proofErr w:type="spellStart"/>
+      <w:r>
+        <w:t>img</w:t>
+      </w:r>
+      <w:proofErr w:type="spellEnd"/>
+      <w:r>
+        <w:t>[index]</w:t>
+      </w:r>
+    </w:p>
+    <w:p>
+      <w:r>
+        <w:t>G=</w:t>
+      </w:r>
+      <w:proofErr w:type="spellStart"/>
+      <w:r>
+        <w:t>img</w:t>
+      </w:r>
+      <w:proofErr w:type="spellEnd"/>
+      <w:r>
+        <w:t>[index+1]</w:t>
+      </w:r>
+    </w:p>
+    <w:p>
+      <w:r>
+        <w:t>B=</w:t>
+      </w:r>
+      <w:proofErr w:type="spellStart"/>
+      <w:r>
+        <w:t>img</w:t>
+      </w:r>
+      <w:proofErr w:type="spellEnd"/>
+      <w:r>
+        <w:t>[index+2]</w:t>
+      </w:r>
+    </w:p>
+    <w:p>
+      <w:r>
+        <w:t xml:space="preserve">For </w:t>
+      </w:r>
+      <w:proofErr w:type="spellStart"/>
+      <w:r>
+        <w:t>e.g</w:t>
+      </w:r>
+      <w:proofErr w:type="spellEnd"/>
+      <w:r>
+        <w:t xml:space="preserve"> </w:t>
+      </w:r>
+      <w:proofErr w:type="gramStart"/>
+      <w:r>
+        <w:t>Pixel(</w:t>
+      </w:r>
+      <w:proofErr w:type="gramEnd"/>
+      <w:r>
+        <w:t>1,0) -&gt; index=(1*2+0)*3=6. So R=</w:t>
+      </w:r>
+      <w:proofErr w:type="spellStart"/>
+      <w:proofErr w:type="gramStart"/>
+      <w:r>
+        <w:t>img</w:t>
+      </w:r>
+      <w:proofErr w:type="spellEnd"/>
+      <w:r>
+        <w:t>[</w:t>
+      </w:r>
+      <w:proofErr w:type="gramEnd"/>
+      <w:r>
+        <w:t>6]</w:t>
+      </w:r>
+      <w:r>
+        <w:t>=70</w:t>
+      </w:r>
+      <w:r>
+        <w:t>, G=</w:t>
+      </w:r>
+      <w:proofErr w:type="spellStart"/>
+      <w:r>
+        <w:t>img</w:t>
+      </w:r>
+      <w:proofErr w:type="spellEnd"/>
+      <w:r>
+        <w:t>[7]</w:t>
+      </w:r>
+      <w:r>
+        <w:t>=80</w:t>
+      </w:r>
+      <w:r>
+        <w:t>, B=</w:t>
+      </w:r>
+      <w:proofErr w:type="spellStart"/>
+      <w:r>
+        <w:t>img</w:t>
+      </w:r>
+      <w:proofErr w:type="spellEnd"/>
+      <w:r>
+        <w:t>[8]</w:t>
+      </w:r>
+      <w:r>
+        <w:t>=90</w:t>
+      </w:r>
+    </w:p>
+    <w:p/>
+    <w:p>
+      <w:r>
+        <w:t>In CUDA, 1 thread processes 1 pixel.</w:t>
+      </w:r>
+    </w:p>
+    <w:p>
+      <w:r>
+        <w:t>In grayscale, 1 thread processes 1 pixel=1 value</w:t>
+      </w:r>
+    </w:p>
+    <w:p>
+      <w:r>
+        <w:t>In RGB, 1 thread processes 1 pixel=3 values.</w:t>
+      </w:r>
+    </w:p>
+    <w:p/>
+    <w:p/>
+    <w:p>
       <w:bookmarkStart w:id="0" w:name="_GoBack"/>
       <w:bookmarkEnd w:id="0"/>
-    </w:p>
-    <w:p>
-      <w:r>
-        <w:t>R=</w:t>
-      </w:r>
-      <w:proofErr w:type="spellStart"/>
-      <w:r>
-        <w:t>img</w:t>
-      </w:r>
-      <w:proofErr w:type="spellEnd"/>
-      <w:r>
-        <w:t>[index]</w:t>
-      </w:r>
-    </w:p>
-    <w:p>
-      <w:r>
-        <w:t>G=</w:t>
-      </w:r>
-      <w:proofErr w:type="spellStart"/>
-      <w:r>
-        <w:t>img</w:t>
-      </w:r>
-      <w:proofErr w:type="spellEnd"/>
-      <w:r>
-        <w:t>[index+1]</w:t>
-      </w:r>
-    </w:p>
-    <w:p>
-      <w:r>
-        <w:t>B=</w:t>
-      </w:r>
-      <w:proofErr w:type="spellStart"/>
-      <w:r>
-        <w:t>img</w:t>
-      </w:r>
-      <w:proofErr w:type="spellEnd"/>
-      <w:r>
-        <w:t>[index+2]</w:t>
-      </w:r>
-    </w:p>
-    <w:p>
-      <w:r>
-        <w:t xml:space="preserve">For </w:t>
-      </w:r>
-      <w:proofErr w:type="spellStart"/>
-      <w:r>
-        <w:t>e.g</w:t>
-      </w:r>
-      <w:proofErr w:type="spellEnd"/>
-      <w:r>
-        <w:t xml:space="preserve"> </w:t>
-      </w:r>
-      <w:proofErr w:type="gramStart"/>
-      <w:r>
-        <w:t>Pixel(</w:t>
-      </w:r>
-      <w:proofErr w:type="gramEnd"/>
-      <w:r>
-        <w:t>1,0) -&gt; index=(1*2+0)*3=6. So R=</w:t>
-      </w:r>
-      <w:proofErr w:type="spellStart"/>
-      <w:proofErr w:type="gramStart"/>
-      <w:r>
-        <w:t>img</w:t>
-      </w:r>
-      <w:proofErr w:type="spellEnd"/>
-      <w:r>
-        <w:t>[</w:t>
-      </w:r>
-      <w:proofErr w:type="gramEnd"/>
-      <w:r>
-        <w:t>6]</w:t>
-      </w:r>
-      <w:r>
-        <w:t>=70</w:t>
-      </w:r>
-      <w:r>
-        <w:t>, G=</w:t>
-      </w:r>
-      <w:proofErr w:type="spellStart"/>
-      <w:r>
-        <w:t>img</w:t>
-      </w:r>
-      <w:proofErr w:type="spellEnd"/>
-      <w:r>
-        <w:t>[7]</w:t>
-      </w:r>
-      <w:r>
-        <w:t>=80</w:t>
-      </w:r>
-      <w:r>
-        <w:t>, B=</w:t>
-      </w:r>
-      <w:proofErr w:type="spellStart"/>
-      <w:r>
-        <w:t>img</w:t>
-      </w:r>
-      <w:proofErr w:type="spellEnd"/>
-      <w:r>
-        <w:t>[8]</w:t>
-      </w:r>
-      <w:r>
-        <w:t>=90</w:t>
-      </w:r>
-    </w:p>
-    <w:p/>
-    <w:p>
-      <w:r>
-        <w:t>In CUDA, 1 thread processes 1 pixel.</w:t>
-      </w:r>
-    </w:p>
-    <w:p>
-      <w:r>
-        <w:t>In grayscale, 1 thread processes 1 pixel=1 value</w:t>
-      </w:r>
-    </w:p>
-    <w:p>
-      <w:r>
-        <w:t>In RGB, 1 thread processes 1 pixel=3 values.</w:t>
-      </w:r>
     </w:p>
     <w:sectPr>
       <w:pgSz w:w="11906" w:h="16838"/>

</xml_diff>

<commit_message>
Added presentation file with matrix explanation, final presentataion given to prof
</commit_message>
<xml_diff>
--- a/docs/Personal Notes.docx
+++ b/docs/Personal Notes.docx
@@ -262,11 +262,43 @@
       </w:r>
     </w:p>
     <w:p/>
-    <w:p/>
-    <w:p>
+    <w:p>
+      <w:pPr>
+        <w:rPr>
+          <w:b/>
+        </w:rPr>
+      </w:pPr>
+      <w:r>
+        <w:rPr>
+          <w:b/>
+        </w:rPr>
+        <w:t>Why do we need tile?</w:t>
+      </w:r>
+    </w:p>
+    <w:p>
+      <w:r>
+        <w:t xml:space="preserve">Your image is huge, entire image in global memory, </w:t>
+      </w:r>
+      <w:proofErr w:type="spellStart"/>
+      <w:r>
+        <w:t>gpu</w:t>
+      </w:r>
+      <w:proofErr w:type="spellEnd"/>
+      <w:r>
+        <w:t xml:space="preserve"> cannot load everything into fast memory. </w:t>
+      </w:r>
+      <w:proofErr w:type="gramStart"/>
+      <w:r>
+        <w:t>So</w:t>
+      </w:r>
+      <w:proofErr w:type="gramEnd"/>
+      <w:r>
+        <w:t xml:space="preserve"> we take small chunk -&gt; process -&gt; move to next. That chunk is tile.</w:t>
+      </w:r>
       <w:bookmarkStart w:id="0" w:name="_GoBack"/>
       <w:bookmarkEnd w:id="0"/>
     </w:p>
+    <w:p/>
     <w:sectPr>
       <w:pgSz w:w="11906" w:h="16838"/>
       <w:pgMar w:top="1440" w:right="1440" w:bottom="1440" w:left="1440" w:header="708" w:footer="708" w:gutter="0"/>

</xml_diff>